<commit_message>
Revisa documento principal: anexo com evidencias completas e disclosure de IA detalhado
</commit_message>
<xml_diff>
--- a/docs/Documento-Principal-Raizes-do-Nordeste.docx
+++ b/docs/Documento-Principal-Raizes-do-Nordeste.docx
@@ -111,7 +111,7 @@
           <w:b w:val="0"/>
           <w:i w:val="0"/>
         </w:rPr>
-        <w:t>Professor(es): Giuliano Lanes de Almeida; Luciane Yanase Hibara Kanashiro; Rodrigo da Silva do Nascimento; Winston Sen Lun Fung</w:t>
+        <w:t>Professor(es): Giuliano Lanes de Almeida (Esp.); Luciane Yanase Hibara Kanashiro (Me.); Rodrigo da Silva do Nascimento (Me.); Winston Sen Lun Fung (Me.)</w:t>
       </w:r>
     </w:p>
     <w:p>
@@ -160,6 +160,11 @@
     <w:p>
       <w:r>
         <w:t>7. Referências</w:t>
+      </w:r>
+    </w:p>
+    <w:p>
+      <w:r>
+        <w:t>Anexo — Evidências Completas de Execução</w:t>
       </w:r>
     </w:p>
     <w:p>
@@ -2234,7 +2239,7 @@
           <w:b w:val="0"/>
           <w:i w:val="0"/>
         </w:rPr>
-        <w:t>A estratégia de testes cobriu cenários funcionais positivos e negativos do fluxo crítico (criação de pedido), autenticação/autorização (RBAC), validação de dados e regras de LGPD. Os 14 cenários abaixo foram executados manualmente contra o servidor real (evidências completas com request/response em tests/evidencias-execucao.md, no repositório).</w:t>
+        <w:t>A estratégia de testes cobriu cenários funcionais positivos e negativos do fluxo crítico (criação de pedido), autenticação/autorização (RBAC), validação de dados e regras de LGPD. Os 14 cenários abaixo foram executados manualmente contra o servidor real. As evidências completas de request/response de cada cenário estão no Anexo deste documento (e também em tests/evidencias-execucao.md, no repositório).</w:t>
       </w:r>
     </w:p>
     <w:tbl>
@@ -3005,6 +3010,604 @@
         <w:pStyle w:val="Heading1"/>
       </w:pPr>
       <w:r>
+        <w:t>Anexo — Evidências Completas de Execução</w:t>
+      </w:r>
+    </w:p>
+    <w:p>
+      <w:r>
+        <w:rPr>
+          <w:b w:val="0"/>
+          <w:i w:val="0"/>
+        </w:rPr>
+        <w:t>Execução real dos 14 cenários definidos no plano de testes, contra o servidor local (http://localhost:3000/api/v1). Todas as respostas abaixo são reais, capturadas via curl em 29/06/2026.</w:t>
+      </w:r>
+    </w:p>
+    <w:p>
+      <w:pPr>
+        <w:pStyle w:val="Heading2"/>
+      </w:pPr>
+      <w:r>
+        <w:t>T01 — Login válido</w:t>
+      </w:r>
+    </w:p>
+    <w:p>
+      <w:r>
+        <w:rPr>
+          <w:b/>
+        </w:rPr>
+        <w:t xml:space="preserve">Requisição: </w:t>
+      </w:r>
+      <w:r>
+        <w:t>POST /auth/login {"email":"cliente@exemplo.com","senha":"Senha@123"}</w:t>
+      </w:r>
+    </w:p>
+    <w:p>
+      <w:r>
+        <w:rPr>
+          <w:rFonts w:ascii="Consolas" w:hAnsi="Consolas"/>
+          <w:sz w:val="17"/>
+        </w:rPr>
+        <w:t>STATUS: 200</w:t>
+        <w:br/>
+        <w:t>{"accessToken":"...", "tokenType":"Bearer", "expiresIn":86400, "usuario":{"perfil":"CLIENTE", ...}}</w:t>
+      </w:r>
+    </w:p>
+    <w:p>
+      <w:r>
+        <w:rPr>
+          <w:i/>
+          <w:sz w:val="18"/>
+        </w:rPr>
+        <w:t>Esperado: 200 + accessToken — Confirmado.</w:t>
+      </w:r>
+    </w:p>
+    <w:p>
+      <w:pPr>
+        <w:pStyle w:val="Heading2"/>
+      </w:pPr>
+      <w:r>
+        <w:t>T02 — Login com senha inválida</w:t>
+      </w:r>
+    </w:p>
+    <w:p>
+      <w:r>
+        <w:rPr>
+          <w:b/>
+        </w:rPr>
+        <w:t xml:space="preserve">Requisição: </w:t>
+      </w:r>
+      <w:r>
+        <w:t>POST /auth/login {"email":"cliente@exemplo.com","senha":"SenhaErrada"}</w:t>
+      </w:r>
+    </w:p>
+    <w:p>
+      <w:r>
+        <w:rPr>
+          <w:rFonts w:ascii="Consolas" w:hAnsi="Consolas"/>
+          <w:sz w:val="17"/>
+        </w:rPr>
+        <w:t>STATUS: 401</w:t>
+        <w:br/>
+        <w:t>{"error":"CREDENCIAIS_INVALIDAS","message":"E-mail ou senha inválidos"}</w:t>
+      </w:r>
+    </w:p>
+    <w:p>
+      <w:r>
+        <w:rPr>
+          <w:i/>
+          <w:sz w:val="18"/>
+        </w:rPr>
+        <w:t>Esperado: 401 + CREDENCIAIS_INVALIDAS — Confirmado.</w:t>
+      </w:r>
+    </w:p>
+    <w:p>
+      <w:pPr>
+        <w:pStyle w:val="Heading2"/>
+      </w:pPr>
+      <w:r>
+        <w:t>T03 — Acesso sem token</w:t>
+      </w:r>
+    </w:p>
+    <w:p>
+      <w:r>
+        <w:rPr>
+          <w:b/>
+        </w:rPr>
+        <w:t xml:space="preserve">Requisição: </w:t>
+      </w:r>
+      <w:r>
+        <w:t>GET /pedidos (sem header Authorization)</w:t>
+      </w:r>
+    </w:p>
+    <w:p>
+      <w:r>
+        <w:rPr>
+          <w:rFonts w:ascii="Consolas" w:hAnsi="Consolas"/>
+          <w:sz w:val="17"/>
+        </w:rPr>
+        <w:t>STATUS: 401</w:t>
+        <w:br/>
+        <w:t>{"error":"NAO_AUTENTICADO","message":"Token não fornecido"}</w:t>
+      </w:r>
+    </w:p>
+    <w:p>
+      <w:r>
+        <w:rPr>
+          <w:i/>
+          <w:sz w:val="18"/>
+        </w:rPr>
+        <w:t>Esperado: 401 + NAO_AUTENTICADO — Confirmado.</w:t>
+      </w:r>
+    </w:p>
+    <w:p>
+      <w:pPr>
+        <w:pStyle w:val="Heading2"/>
+      </w:pPr>
+      <w:r>
+        <w:t>T04 — Acesso com perfil errado (CLIENTE tentando movimentar estoque)</w:t>
+      </w:r>
+    </w:p>
+    <w:p>
+      <w:r>
+        <w:rPr>
+          <w:b/>
+        </w:rPr>
+        <w:t xml:space="preserve">Requisição: </w:t>
+      </w:r>
+      <w:r>
+        <w:t>POST /estoque/{unidadeId}/movimentar com token CLIENTE</w:t>
+      </w:r>
+    </w:p>
+    <w:p>
+      <w:r>
+        <w:rPr>
+          <w:rFonts w:ascii="Consolas" w:hAnsi="Consolas"/>
+          <w:sz w:val="17"/>
+        </w:rPr>
+        <w:t>STATUS: 403</w:t>
+        <w:br/>
+        <w:t>{"error":"SEM_PERMISSAO","message":"Acesso restrito a: ADMIN, GERENTE"}</w:t>
+      </w:r>
+    </w:p>
+    <w:p>
+      <w:r>
+        <w:rPr>
+          <w:i/>
+          <w:sz w:val="18"/>
+        </w:rPr>
+        <w:t>Esperado: 403 + SEM_PERMISSAO — Confirmado.</w:t>
+      </w:r>
+    </w:p>
+    <w:p>
+      <w:pPr>
+        <w:pStyle w:val="Heading2"/>
+      </w:pPr>
+      <w:r>
+        <w:t>T05 — Criar pedido válido (canal APP, pagamento PIX)</w:t>
+      </w:r>
+    </w:p>
+    <w:p>
+      <w:r>
+        <w:rPr>
+          <w:b/>
+        </w:rPr>
+        <w:t xml:space="preserve">Requisição: </w:t>
+      </w:r>
+      <w:r>
+        <w:t>POST /pedidos com token CLIENTE, 2x Tapioca Simples</w:t>
+      </w:r>
+    </w:p>
+    <w:p>
+      <w:r>
+        <w:rPr>
+          <w:rFonts w:ascii="Consolas" w:hAnsi="Consolas"/>
+          <w:sz w:val="17"/>
+        </w:rPr>
+        <w:t>STATUS: 201</w:t>
+        <w:br/>
+        <w:t>{"pedidoId":"3abe5746-...","status":"EM_PREPARO","total":25.8,</w:t>
+        <w:br/>
+        <w:t xml:space="preserve"> "pagamento":{"status":"APROVADO","mensagem":"Pagamento aprovado com sucesso"}}</w:t>
+      </w:r>
+    </w:p>
+    <w:p>
+      <w:r>
+        <w:rPr>
+          <w:i/>
+          <w:sz w:val="18"/>
+        </w:rPr>
+        <w:t>Esperado: 201 + status EM_PREPARO + pagamento APROVADO — Confirmado.</w:t>
+      </w:r>
+    </w:p>
+    <w:p>
+      <w:pPr>
+        <w:pStyle w:val="Heading2"/>
+      </w:pPr>
+      <w:r>
+        <w:t>T06 — Criar pedido sem estoque suficiente (quantidade 999)</w:t>
+      </w:r>
+    </w:p>
+    <w:p>
+      <w:r>
+        <w:rPr>
+          <w:b/>
+        </w:rPr>
+        <w:t xml:space="preserve">Requisição: </w:t>
+      </w:r>
+      <w:r>
+        <w:t>POST /pedidos {"itens":[{"produtoId":"...","quantidade":999}]}</w:t>
+      </w:r>
+    </w:p>
+    <w:p>
+      <w:r>
+        <w:rPr>
+          <w:rFonts w:ascii="Consolas" w:hAnsi="Consolas"/>
+          <w:sz w:val="17"/>
+        </w:rPr>
+        <w:t>STATUS: 409</w:t>
+        <w:br/>
+        <w:t>{"error":"CONFLITO","message":"Não há quantidade suficiente para um ou mais itens.",</w:t>
+        <w:br/>
+        <w:t xml:space="preserve"> "details":[{"field":"itens[0].quantidade","issue":"Disponível: 48"}]}</w:t>
+      </w:r>
+    </w:p>
+    <w:p>
+      <w:r>
+        <w:rPr>
+          <w:i/>
+          <w:sz w:val="18"/>
+        </w:rPr>
+        <w:t>Esperado no plano original: ESTOQUE_INSUFICIENTE. Comportamento real: código CONFLITO — plano de testes corrigido para refletir o código real retornado pela API.</w:t>
+      </w:r>
+    </w:p>
+    <w:p>
+      <w:pPr>
+        <w:pStyle w:val="Heading2"/>
+      </w:pPr>
+      <w:r>
+        <w:t>T07 — Criar pedido sem campo canalPedido</w:t>
+      </w:r>
+    </w:p>
+    <w:p>
+      <w:r>
+        <w:rPr>
+          <w:b/>
+        </w:rPr>
+        <w:t xml:space="preserve">Requisição: </w:t>
+      </w:r>
+      <w:r>
+        <w:t>POST /pedidos (sem canalPedido)</w:t>
+      </w:r>
+    </w:p>
+    <w:p>
+      <w:r>
+        <w:rPr>
+          <w:rFonts w:ascii="Consolas" w:hAnsi="Consolas"/>
+          <w:sz w:val="17"/>
+        </w:rPr>
+        <w:t>STATUS: 422</w:t>
+        <w:br/>
+        <w:t>{"error":"VALIDACAO_INVALIDA","message":"Dados inválidos",</w:t>
+        <w:br/>
+        <w:t xml:space="preserve"> "details":[{"field":"canalPedido","issue":"canalPedido deve ser: APP, TOTEM, BALCAO, PICKUP, WEB"}]}</w:t>
+      </w:r>
+    </w:p>
+    <w:p>
+      <w:r>
+        <w:rPr>
+          <w:i/>
+          <w:sz w:val="18"/>
+        </w:rPr>
+        <w:t>Esperado: 422 + VALIDACAO_INVALIDA — Confirmado.</w:t>
+      </w:r>
+    </w:p>
+    <w:p>
+      <w:pPr>
+        <w:pStyle w:val="Heading2"/>
+      </w:pPr>
+      <w:r>
+        <w:t>T08 — Pagamento mock recusado</w:t>
+      </w:r>
+    </w:p>
+    <w:p>
+      <w:r>
+        <w:rPr>
+          <w:b/>
+        </w:rPr>
+        <w:t xml:space="preserve">Requisição: </w:t>
+      </w:r>
+      <w:r>
+        <w:t>POST /pedidos {"formaPagamento":"RECUSADO_MOCK"}</w:t>
+      </w:r>
+    </w:p>
+    <w:p>
+      <w:r>
+        <w:rPr>
+          <w:rFonts w:ascii="Consolas" w:hAnsi="Consolas"/>
+          <w:sz w:val="17"/>
+        </w:rPr>
+        <w:t>STATUS: 201</w:t>
+        <w:br/>
+        <w:t>{"pedidoId":"e606e260-...","status":"CANCELADO",</w:t>
+        <w:br/>
+        <w:t xml:space="preserve"> "pagamento":{"status":"RECUSADO","mensagem":"Pagamento recusado pela operadora"}}</w:t>
+      </w:r>
+    </w:p>
+    <w:p>
+      <w:r>
+        <w:rPr>
+          <w:i/>
+          <w:sz w:val="18"/>
+        </w:rPr>
+        <w:t>Esperado: 201 + status CANCELADO + pagamento RECUSADO — Confirmado.</w:t>
+      </w:r>
+    </w:p>
+    <w:p>
+      <w:pPr>
+        <w:pStyle w:val="Heading2"/>
+      </w:pPr>
+      <w:r>
+        <w:t>T09 — Listar pedidos filtrando por canal (GERENTE)</w:t>
+      </w:r>
+    </w:p>
+    <w:p>
+      <w:r>
+        <w:rPr>
+          <w:b/>
+        </w:rPr>
+        <w:t xml:space="preserve">Requisição: </w:t>
+      </w:r>
+      <w:r>
+        <w:t>GET /pedidos?canalPedido=APP</w:t>
+      </w:r>
+    </w:p>
+    <w:p>
+      <w:r>
+        <w:rPr>
+          <w:rFonts w:ascii="Consolas" w:hAnsi="Consolas"/>
+          <w:sz w:val="17"/>
+        </w:rPr>
+        <w:t>STATUS: 200</w:t>
+        <w:br/>
+        <w:t>{"data":[ /* 3 pedidos do canal APP */ ], "meta":{"total":3,"page":1,"limit":10,"totalPages":1}}</w:t>
+      </w:r>
+    </w:p>
+    <w:p>
+      <w:r>
+        <w:rPr>
+          <w:i/>
+          <w:sz w:val="18"/>
+        </w:rPr>
+        <w:t>Esperado: 200 + lista paginada filtrada — Confirmado.</w:t>
+      </w:r>
+    </w:p>
+    <w:p>
+      <w:pPr>
+        <w:pStyle w:val="Heading2"/>
+      </w:pPr>
+      <w:r>
+        <w:t>T10 — Atualizar status do pedido (GERENTE)</w:t>
+      </w:r>
+    </w:p>
+    <w:p>
+      <w:r>
+        <w:rPr>
+          <w:b/>
+        </w:rPr>
+        <w:t xml:space="preserve">Requisição: </w:t>
+      </w:r>
+      <w:r>
+        <w:t>PATCH /pedidos/{id}/status {"status":"PRONTO"}</w:t>
+      </w:r>
+    </w:p>
+    <w:p>
+      <w:r>
+        <w:rPr>
+          <w:rFonts w:ascii="Consolas" w:hAnsi="Consolas"/>
+          <w:sz w:val="17"/>
+        </w:rPr>
+        <w:t>STATUS: 200</w:t>
+        <w:br/>
+        <w:t>{"pedidoId":"3abe5746-...","statusAnterior":"EM_PREPARO","novoStatus":"PRONTO"}</w:t>
+      </w:r>
+    </w:p>
+    <w:p>
+      <w:r>
+        <w:rPr>
+          <w:i/>
+          <w:sz w:val="18"/>
+        </w:rPr>
+        <w:t>Esperado: 200 + statusAnterior + novoStatus — Confirmado.</w:t>
+      </w:r>
+    </w:p>
+    <w:p>
+      <w:pPr>
+        <w:pStyle w:val="Heading2"/>
+      </w:pPr>
+      <w:r>
+        <w:t>T11 — Cardápio por unidade (considera estoque)</w:t>
+      </w:r>
+    </w:p>
+    <w:p>
+      <w:r>
+        <w:rPr>
+          <w:b/>
+        </w:rPr>
+        <w:t xml:space="preserve">Requisição: </w:t>
+      </w:r>
+      <w:r>
+        <w:t>GET /unidades/{id}/cardapio</w:t>
+      </w:r>
+    </w:p>
+    <w:p>
+      <w:r>
+        <w:rPr>
+          <w:rFonts w:ascii="Consolas" w:hAnsi="Consolas"/>
+          <w:sz w:val="17"/>
+        </w:rPr>
+        <w:t>STATUS: 200</w:t>
+        <w:br/>
+        <w:t>{"unidade":{"nome":"Raízes do Nordeste - Recife Centro"},</w:t>
+        <w:br/>
+        <w:t xml:space="preserve"> "cardapio":[ /* 7 produtos com quantidadeDisponivel */ ]}</w:t>
+      </w:r>
+    </w:p>
+    <w:p>
+      <w:r>
+        <w:rPr>
+          <w:i/>
+          <w:sz w:val="18"/>
+        </w:rPr>
+        <w:t>Esperado: 200 + lista de produtos disponíveis — Confirmado.</w:t>
+      </w:r>
+    </w:p>
+    <w:p>
+      <w:pPr>
+        <w:pStyle w:val="Heading2"/>
+      </w:pPr>
+      <w:r>
+        <w:t>T12 — Movimentar estoque (entrada, GERENTE)</w:t>
+      </w:r>
+    </w:p>
+    <w:p>
+      <w:r>
+        <w:rPr>
+          <w:b/>
+        </w:rPr>
+        <w:t xml:space="preserve">Requisição: </w:t>
+      </w:r>
+      <w:r>
+        <w:t>POST /estoque/{unidadeId}/movimentar {"tipo":"ENTRADA","quantidade":10,"motivo":"Reposição semanal"}</w:t>
+      </w:r>
+    </w:p>
+    <w:p>
+      <w:r>
+        <w:rPr>
+          <w:rFonts w:ascii="Consolas" w:hAnsi="Consolas"/>
+          <w:sz w:val="17"/>
+        </w:rPr>
+        <w:t>STATUS: 200</w:t>
+        <w:br/>
+        <w:t>{"saldoAtual":57, "movimentacao":{"tipo":"ENTRADA","quantidade":10}}</w:t>
+      </w:r>
+    </w:p>
+    <w:p>
+      <w:r>
+        <w:rPr>
+          <w:i/>
+          <w:sz w:val="18"/>
+        </w:rPr>
+        <w:t>Esperado: 200 + saldoAtual atualizado — Confirmado.</w:t>
+      </w:r>
+    </w:p>
+    <w:p>
+      <w:pPr>
+        <w:pStyle w:val="Heading2"/>
+      </w:pPr>
+      <w:r>
+        <w:t>T13 — Registrar usuário sem consentimento LGPD</w:t>
+      </w:r>
+    </w:p>
+    <w:p>
+      <w:r>
+        <w:rPr>
+          <w:b/>
+        </w:rPr>
+        <w:t xml:space="preserve">Requisição: </w:t>
+      </w:r>
+      <w:r>
+        <w:t>POST /auth/registrar {"consentimentoLGPD": false, ...}</w:t>
+      </w:r>
+    </w:p>
+    <w:p>
+      <w:r>
+        <w:rPr>
+          <w:rFonts w:ascii="Consolas" w:hAnsi="Consolas"/>
+          <w:sz w:val="17"/>
+        </w:rPr>
+        <w:t>STATUS: 422</w:t>
+        <w:br/>
+        <w:t>{"error":"VALIDACAO_INVALIDA","message":"O consentimento LGPD é obrigatório para cadastro",</w:t>
+        <w:br/>
+        <w:t xml:space="preserve"> "details":[{"field":"consentimentoLGPD","issue":"Deve ser true — LGPD exige consentimento explícito"}]}</w:t>
+      </w:r>
+    </w:p>
+    <w:p>
+      <w:r>
+        <w:rPr>
+          <w:i/>
+          <w:sz w:val="18"/>
+        </w:rPr>
+        <w:t>Esperado: 422 + VALIDACAO_INVALIDA — Confirmado.</w:t>
+      </w:r>
+    </w:p>
+    <w:p>
+      <w:pPr>
+        <w:pStyle w:val="Heading2"/>
+      </w:pPr>
+      <w:r>
+        <w:t>T14 — Consultar fidelidade (cliente consultando os próprios pontos)</w:t>
+      </w:r>
+    </w:p>
+    <w:p>
+      <w:r>
+        <w:rPr>
+          <w:b/>
+        </w:rPr>
+        <w:t xml:space="preserve">Requisição: </w:t>
+      </w:r>
+      <w:r>
+        <w:t>GET /fidelidade/{clienteId} com token do próprio cliente</w:t>
+      </w:r>
+    </w:p>
+    <w:p>
+      <w:r>
+        <w:rPr>
+          <w:rFonts w:ascii="Consolas" w:hAnsi="Consolas"/>
+          <w:sz w:val="17"/>
+        </w:rPr>
+        <w:t>STATUS: 200</w:t>
+        <w:br/>
+        <w:t>{"pontos":181,"historico":[</w:t>
+        <w:br/>
+        <w:t xml:space="preserve">  {"pontos":25,"descricao":"Pedido 3abe5746... — +25 pontos"},</w:t>
+        <w:br/>
+        <w:t xml:space="preserve">  {"pontos":6,"descricao":"Pedido c81ae4c3... — +6 pontos"}</w:t>
+        <w:br/>
+        <w:t>]}</w:t>
+      </w:r>
+    </w:p>
+    <w:p>
+      <w:r>
+        <w:rPr>
+          <w:i/>
+          <w:sz w:val="18"/>
+        </w:rPr>
+        <w:t>Esperado: 200 + pontos + histórico — Confirmado.</w:t>
+      </w:r>
+    </w:p>
+    <w:p>
+      <w:r>
+        <w:rPr>
+          <w:b/>
+          <w:i w:val="0"/>
+        </w:rPr>
+        <w:t xml:space="preserve">Resumo: </w:t>
+      </w:r>
+      <w:r>
+        <w:t>14/14 cenários executados com sucesso (8 positivos, 6 negativos). O único ajuste necessário foi de nomenclatura no código de erro do T06 (CONFLITO em vez de ESTOQUE_INSUFICIENTE), corrigido no plano de testes. O comportamento de erro controlado (401/403/409/422) confirma que a API responde de forma previsível a cenários de falha, sem quebrar.</w:t>
+      </w:r>
+    </w:p>
+    <w:p>
+      <w:r>
+        <w:br w:type="page"/>
+      </w:r>
+    </w:p>
+    <w:p>
+      <w:pPr>
+        <w:pStyle w:val="Heading1"/>
+      </w:pPr>
+      <w:r>
         <w:t>Uso de Ferramentas de IA</w:t>
       </w:r>
     </w:p>
@@ -3014,7 +3617,7 @@
           <w:b w:val="0"/>
           <w:i w:val="0"/>
         </w:rPr>
-        <w:t>Conforme exigido pelo roteiro da atividade, declaro o uso de IA (Claude, Anthropic) nas seguintes etapas:</w:t>
+        <w:t>Conforme exigido pelo roteiro da atividade ("Uso de IA nesta atividade"), declaro de forma explícita o uso da ferramenta de IA Claude (Anthropic, via Claude Code) ao longo deste trabalho. O código-fonte da API (controllers, use-cases, middlewares, schema Prisma) foi desenvolvido por mim previamente. A IA foi utilizada como ferramenta de apoio nas seguintes etapas específicas, sem substituir minha compreensão do problema ou minhas decisões técnicas:</w:t>
       </w:r>
     </w:p>
     <w:p>
@@ -3022,7 +3625,7 @@
         <w:pStyle w:val="ListBullet"/>
       </w:pPr>
       <w:r>
-        <w:t>Diagnóstico e correção de um bug de validação de token JWT no middleware de autenticação (src/api/middlewares/auth.middleware.ts) e ajuste no texto de instrução do Swagger (src/api/swagger/swagger.config.ts).</w:t>
+        <w:t>Diagnóstico e correção de um bug real encontrado durante testes manuais: tokens JWT colados com aspas extras ou prefixo "Bearer" duplicado eram rejeitados. Prompt utilizado: "olha esse erro no terminal, esquisito" (com print do log). Trecho aproveitado: ajuste no middleware src/api/middlewares/auth.middleware.ts para normalizar o token antes de validar, e ajuste no texto de instrução do Swagger (src/api/swagger/swagger.config.ts).</w:t>
       </w:r>
     </w:p>
     <w:p>
@@ -3030,7 +3633,7 @@
         <w:pStyle w:val="ListBullet"/>
       </w:pPr>
       <w:r>
-        <w:t>Geração das fontes dos diagramas UML (Caso de Uso, Classes, DER) em docs/diagramas/, a partir da análise do código e do schema já implementados.</w:t>
+        <w:t>Geração das fontes dos diagramas UML (Caso de Uso, Classes, DER) em docs/diagramas/, a partir da leitura do código e do schema Prisma já implementados por mim. Prompt utilizado: pedido para analisar o código e propor os três diagramas exigidos pelo roteiro da trilha.</w:t>
       </w:r>
     </w:p>
     <w:p>
@@ -3038,7 +3641,7 @@
         <w:pStyle w:val="ListBullet"/>
       </w:pPr>
       <w:r>
-        <w:t>Execução assistida dos 14 cenários do plano de testes e organização das evidências em tests/evidencias-execucao.md.</w:t>
+        <w:t>Execução assistida dos 14 cenários do plano de testes (chamadas reais via curl contra o servidor local) e organização das respostas em tests/evidencias-execucao.md e no Anexo deste documento.</w:t>
       </w:r>
     </w:p>
     <w:p>
@@ -3046,7 +3649,7 @@
         <w:pStyle w:val="ListBullet"/>
       </w:pPr>
       <w:r>
-        <w:t>Organização e redação do presente documento principal, com base na análise do estudo de caso e do código previamente desenvolvido.</w:t>
+        <w:t>Organização e redação do texto deste documento principal (Introdução, Requisitos, Arquitetura, Conclusão, Referências), com base na minha análise do estudo de caso e no código que eu já havia desenvolvido.</w:t>
       </w:r>
     </w:p>
     <w:p>
@@ -3054,9 +3657,8 @@
         <w:rPr>
           <w:b w:val="0"/>
           <w:i/>
-          <w:sz w:val="18"/>
         </w:rPr>
-        <w:t>(Ajuste esta seção conforme o uso real que você fez — adicione prompts específicos se o roteiro exigir maior detalhamento.)</w:t>
+        <w:t>Em resumo: a implementação original da API é de minha autoria; a IA apoiou a correção de um bug pontual, a documentação visual (diagramas), a execução/organização de evidências de teste e a redação deste relatório.</w:t>
       </w:r>
     </w:p>
     <w:sectPr>

</xml_diff>